<commit_message>
feat: add admin self-registration with warehouse creation
</commit_message>
<xml_diff>
--- a/docs/Advanced_WMS_Black_Book_With_Database_Tables.docx
+++ b/docs/Advanced_WMS_Black_Book_With_Database_Tables.docx
@@ -220,13 +220,7 @@
               <w:rPr>
                 <w:sz w:val="20"/>
               </w:rPr>
-              <w:t xml:space="preserve">Java 17+, Spring Boot 3, Spring Data JPA, Spring </w:t>
-            </w:r>
-            <w:r>
-              <w:rPr>
-                <w:sz w:val="20"/>
-              </w:rPr>
-              <w:t>Security JWT</w:t>
+              <w:t>Java 17+, Spring Boot 3, Spring Data JPA, Spring Security JWT</w:t>
             </w:r>
           </w:p>
         </w:tc>
@@ -489,13 +483,7 @@
               <w:rPr>
                 <w:sz w:val="20"/>
               </w:rPr>
-              <w:t xml:space="preserve">React.js frontend, Java Spring Boot </w:t>
-            </w:r>
-            <w:r>
-              <w:rPr>
-                <w:sz w:val="20"/>
-              </w:rPr>
-              <w:t>backend, REST API, JWT security, Docker support and GitHub Actions CI.</w:t>
+              <w:t>React.js frontend, Java Spring Boot backend, REST API, JWT security, Docker support and GitHub Actions CI.</w:t>
             </w:r>
           </w:p>
         </w:tc>
@@ -579,13 +567,7 @@
               <w:rPr>
                 <w:sz w:val="20"/>
               </w:rPr>
-              <w:t>JUnit 5 and Spring Boot integration tests for war</w:t>
-            </w:r>
-            <w:r>
-              <w:rPr>
-                <w:sz w:val="20"/>
-              </w:rPr>
-              <w:t>ehouse, receiving and order workflows; frontend production build verification; user acceptance flow through the React UI.</w:t>
+              <w:t>JUnit 5 and Spring Boot integration tests for warehouse, receiving and order workflows; frontend production build verification; user acceptance flow through the React UI.</w:t>
             </w:r>
           </w:p>
         </w:tc>
@@ -594,18 +576,12 @@
     <w:p/>
     <w:p>
       <w:r>
-        <w:t>This report follows the Development index provided for web/mobile application documentation. The content is customized for the Advan</w:t>
-      </w:r>
-      <w:r>
-        <w:t>ced Warehouse Management System implemented in the current project repository.</w:t>
+        <w:t>This report follows the Development index provided for web/mobile application documentation. The content is customized for the Advanced Warehouse Management System implemented in the current project repository.</w:t>
       </w:r>
     </w:p>
     <w:p>
       <w:r>
-        <w:t xml:space="preserve">The purpose of this black book is to explain the project in a simple and complete way. It covers why the project is needed, what problem it solves, how the design is </w:t>
-      </w:r>
-      <w:r>
-        <w:t>prepared, how the frontend and backend are implemented, how the database stores information, and how testing is done before submission.</w:t>
+        <w:t>The purpose of this black book is to explain the project in a simple and complete way. It covers why the project is needed, what problem it solves, how the design is prepared, how the frontend and backend are implemented, how the database stores information, and how testing is done before submission.</w:t>
       </w:r>
     </w:p>
     <w:p>
@@ -1835,21 +1811,12 @@
     </w:p>
     <w:p>
       <w:r>
-        <w:t xml:space="preserve">The Advanced Warehouse Management System is a web-based </w:t>
-      </w:r>
-      <w:r>
-        <w:t>enterprise application designed to automate warehouse operations such as product catalog management, storage hierarchy maintenance, inventory receiving, putaway, stock tracking and customer order fulfillment. The project is based on the Enterprise Warehous</w:t>
-      </w:r>
-      <w:r>
-        <w:t>e Management System brief from the Infotact Technical Internship Program.</w:t>
+        <w:t>The Advanced Warehouse Management System is a web-based enterprise application designed to automate warehouse operations such as product catalog management, storage hierarchy maintenance, inventory receiving, putaway, stock tracking and customer order fulfillment. The project is based on the Enterprise Warehouse Management System brief from the Infotact Technical Internship Program.</w:t>
       </w:r>
     </w:p>
     <w:p>
       <w:r>
-        <w:t>Modern warehouses handle large volumes of products, multiple storage locations and fast order turnaround. Manual spreadsheet-based tracking can cause stock mismatch, misplaced items,</w:t>
-      </w:r>
-      <w:r>
-        <w:t xml:space="preserve"> slow picking and delayed dispatch. This system solves those problems by connecting a React dashboard with secure Spring Boot REST APIs and a PostgreSQL relational database.</w:t>
+        <w:t>Modern warehouses handle large volumes of products, multiple storage locations and fast order turnaround. Manual spreadsheet-based tracking can cause stock mismatch, misplaced items, slow picking and delayed dispatch. This system solves those problems by connecting a React dashboard with secure Spring Boot REST APIs and a PostgreSQL relational database.</w:t>
       </w:r>
     </w:p>
     <w:p>
@@ -1861,10 +1828,7 @@
         <w:t xml:space="preserve">Meaning of WMS: </w:t>
       </w:r>
       <w:r>
-        <w:t>A Warehouse Management System is software that helps a company man</w:t>
-      </w:r>
-      <w:r>
-        <w:t>age goods inside a warehouse. It keeps records of where products are stored, how much stock is available, which orders are pending, and which items need to be picked, packed or shipped.</w:t>
+        <w:t>A Warehouse Management System is software that helps a company manage goods inside a warehouse. It keeps records of where products are stored, how much stock is available, which orders are pending, and which items need to be picked, packed or shipped.</w:t>
       </w:r>
     </w:p>
     <w:p>
@@ -1876,10 +1840,7 @@
         <w:t xml:space="preserve">Need of the project: </w:t>
       </w:r>
       <w:r>
-        <w:t>In a manual warehouse, workers may write stock de</w:t>
-      </w:r>
-      <w:r>
-        <w:t>tails in registers or spreadsheets. This is slow and can lead to mistakes. A web-based system updates information immediately and gives all users the same latest data. This improves speed, accuracy and control.</w:t>
+        <w:t>In a manual warehouse, workers may write stock details in registers or spreadsheets. This is slow and can lead to mistakes. A web-based system updates information immediately and gives all users the same latest data. This improves speed, accuracy and control.</w:t>
       </w:r>
     </w:p>
     <w:p>
@@ -1891,10 +1852,7 @@
         <w:t xml:space="preserve">Proposed solution: </w:t>
       </w:r>
       <w:r>
-        <w:t>The proposed system provid</w:t>
-      </w:r>
-      <w:r>
-        <w:t>es a login-based dashboard where an administrator or operator can manage products, warehouse locations, incoming stock and customer orders. The backend applies business rules so that stock changes happen safely and the database remains consistent.</w:t>
+        <w:t>The proposed system provides a login-based dashboard where an administrator or operator can manage products, warehouse locations, incoming stock and customer orders. The backend applies business rules so that stock changes happen safely and the database remains consistent.</w:t>
       </w:r>
     </w:p>
     <w:p>
@@ -1902,42 +1860,27 @@
         <w:pStyle w:val="Heading2"/>
       </w:pPr>
       <w:r>
-        <w:t>1.1 Prob</w:t>
-      </w:r>
-      <w:r>
-        <w:t>lem Statement</w:t>
+        <w:t>1.1 Problem Statement</w:t>
       </w:r>
     </w:p>
     <w:p>
       <w:r>
-        <w:t>Traditional warehouse operations often depend on manual registers or disconnected spreadsheets. This creates operational bottlenecks: inventory is not updated in real time, stock can be stored in the wrong bin, and orders may be accepted even</w:t>
-      </w:r>
-      <w:r>
-        <w:t xml:space="preserve"> when stock is unavailable. These issues lead to stockouts, delayed order packing and poor visibility for warehouse managers.</w:t>
+        <w:t>Traditional warehouse operations often depend on manual registers or disconnected spreadsheets. This creates operational bottlenecks: inventory is not updated in real time, stock can be stored in the wrong bin, and orders may be accepted even when stock is unavailable. These issues lead to stockouts, delayed order packing and poor visibility for warehouse managers.</w:t>
       </w:r>
     </w:p>
     <w:p>
       <w:r>
-        <w:t>The problem is to design and implement a secure, database-driven WMS that maintains accurate inventory data, assigns inbound stock</w:t>
-      </w:r>
-      <w:r>
-        <w:t xml:space="preserve"> to available storage bins, supports barcode/QR based identification and guides orders through a controlled fulfillment workflow.</w:t>
+        <w:t>The problem is to design and implement a secure, database-driven WMS that maintains accurate inventory data, assigns inbound stock to available storage bins, supports barcode/QR based identification and guides orders through a controlled fulfillment workflow.</w:t>
       </w:r>
     </w:p>
     <w:p>
       <w:r>
-        <w:t xml:space="preserve">The main challenge in warehouse software is not only storing product details. The system must also know the correct </w:t>
-      </w:r>
-      <w:r>
-        <w:t>quantity, location and status of every item. If two users update the same stock at the same time, the final quantity should still be correct. For this reason, the project uses transactions and database locking during important inventory operations.</w:t>
+        <w:t>The main challenge in warehouse software is not only storing product details. The system must also know the correct quantity, location and status of every item. If two users update the same stock at the same time, the final quantity should still be correct. For this reason, the project uses transactions and database locking during important inventory operations.</w:t>
       </w:r>
     </w:p>
     <w:p>
       <w:r>
-        <w:t>Another</w:t>
-      </w:r>
-      <w:r>
-        <w:t xml:space="preserve"> challenge is easy use by warehouse staff. Floor operators need clear screens and simple forms because warehouse work is time-sensitive. The React frontend is therefore designed as a practical dashboard with separate tabs for common tasks.</w:t>
+        <w:t>Another challenge is easy use by warehouse staff. Floor operators need clear screens and simple forms because warehouse work is time-sensitive. The React frontend is therefore designed as a practical dashboard with separate tabs for common tasks.</w:t>
       </w:r>
     </w:p>
     <w:p>
@@ -1954,10 +1897,7 @@
         <w:spacing w:after="80"/>
       </w:pPr>
       <w:r>
-        <w:t>C</w:t>
-      </w:r>
-      <w:r>
-        <w:t>reate a hierarchical warehouse model with warehouses, zones, aisles and storage bins.</w:t>
+        <w:t>Create a hierarchical warehouse model with warehouses, zones, aisles and storage bins.</w:t>
       </w:r>
     </w:p>
     <w:p>
@@ -1976,10 +1916,7 @@
       </w:pPr>
       <w:r>
         <w:lastRenderedPageBreak/>
-        <w:t>Implement transactional receiving and putaway logic that updates stock and bi</w:t>
-      </w:r>
-      <w:r>
-        <w:t>n capacity atomically.</w:t>
+        <w:t>Implement transactional receiving and putaway logic that updates stock and bin capacity atomically.</w:t>
       </w:r>
     </w:p>
     <w:p>
@@ -2015,10 +1952,7 @@
         <w:spacing w:after="80"/>
       </w:pPr>
       <w:r>
-        <w:t xml:space="preserve">Secure APIs using JWT </w:t>
-      </w:r>
-      <w:r>
-        <w:t>authentication and role-based access for ADMIN and OPERATOR users.</w:t>
+        <w:t>Secure APIs using JWT authentication and role-based access for ADMIN and OPERATOR users.</w:t>
       </w:r>
     </w:p>
     <w:p>
@@ -2045,18 +1979,12 @@
         <w:spacing w:after="80"/>
       </w:pPr>
       <w:r>
-        <w:t>Verify the system through automated backend tests</w:t>
-      </w:r>
-      <w:r>
-        <w:t xml:space="preserve"> and frontend build validation.</w:t>
+        <w:t>Verify the system through automated backend tests and frontend build validation.</w:t>
       </w:r>
     </w:p>
     <w:p>
       <w:r>
-        <w:t>These objectives make the system useful for both management-level users and floor-level users. A manager gets visibility of warehouse capacity and stock, while an operator gets a guided workflow for receiving, picking and or</w:t>
-      </w:r>
-      <w:r>
-        <w:t>der processing.</w:t>
+        <w:t>These objectives make the system useful for both management-level users and floor-level users. A manager gets visibility of warehouse capacity and stock, while an operator gets a guided workflow for receiving, picking and order processing.</w:t>
       </w:r>
     </w:p>
     <w:p>
@@ -2080,10 +2008,7 @@
         <w:t xml:space="preserve">Technical objective: </w:t>
       </w:r>
       <w:r>
-        <w:t>The system should be built using modern Jav</w:t>
-      </w:r>
-      <w:r>
-        <w:t>a web development practices such as REST APIs, JPA, validation, JWT security, PostgreSQL and automated tests.</w:t>
+        <w:t>The system should be built using modern Java web development practices such as REST APIs, JPA, validation, JWT security, PostgreSQL and automated tests.</w:t>
       </w:r>
     </w:p>
     <w:p>
@@ -2095,10 +2020,7 @@
         <w:t xml:space="preserve">Quality objective: </w:t>
       </w:r>
       <w:r>
-        <w:t>The system should be easy to understand, easy to run locally, and organized in a way that future developers can maintain and ex</w:t>
-      </w:r>
-      <w:r>
-        <w:t>tend.</w:t>
+        <w:t>The system should be easy to understand, easy to run locally, and organized in a way that future developers can maintain and extend.</w:t>
       </w:r>
     </w:p>
     <w:p>
@@ -2156,10 +2078,7 @@
         <w:spacing w:after="80"/>
       </w:pPr>
       <w:r>
-        <w:t>Receiving, putaway and invento</w:t>
-      </w:r>
-      <w:r>
-        <w:t>ry snapshot viewing.</w:t>
+        <w:t>Receiving, putaway and inventory snapshot viewing.</w:t>
       </w:r>
     </w:p>
     <w:p>
@@ -2200,10 +2119,7 @@
     </w:p>
     <w:p>
       <w:r>
-        <w:t xml:space="preserve">The current scope does not include live </w:t>
-      </w:r>
-      <w:r>
-        <w:t>handheld scanner hardware integration, advanced route optimization, machine-learning demand forecasting or payment/accounting modules. These are listed as future enhancements.</w:t>
+        <w:t>The current scope does not include live handheld scanner hardware integration, advanced route optimization, machine-learning demand forecasting or payment/accounting modules. These are listed as future enhancements.</w:t>
       </w:r>
     </w:p>
     <w:p>
@@ -2215,10 +2131,7 @@
         <w:t xml:space="preserve">Users in scope: </w:t>
       </w:r>
       <w:r>
-        <w:t>The main users are ADMIN and OPERATOR. ADMIN users manage master</w:t>
-      </w:r>
-      <w:r>
-        <w:t xml:space="preserve"> data, users and procurement. OPERATOR users mainly work with receiving, inventory and order movement.</w:t>
+        <w:t>The main users are ADMIN and OPERATOR. ADMIN users manage master data, users and procurement. OPERATOR users mainly work with receiving, inventory and order movement.</w:t>
       </w:r>
     </w:p>
     <w:p>
@@ -2230,10 +2143,7 @@
         <w:t xml:space="preserve">Data in scope: </w:t>
       </w:r>
       <w:r>
-        <w:t>The system stores warehouse locations, product details, inventory quantities, stock movements, customer orders, purchase orders, suppliers</w:t>
-      </w:r>
-      <w:r>
-        <w:t xml:space="preserve"> and application users.</w:t>
+        <w:t>The system stores warehouse locations, product details, inventory quantities, stock movements, customer orders, purchase orders, suppliers and application users.</w:t>
       </w:r>
     </w:p>
     <w:p>
@@ -2265,21 +2175,12 @@
     </w:p>
     <w:p>
       <w:r>
-        <w:t>The sys</w:t>
-      </w:r>
-      <w:r>
-        <w:t xml:space="preserve">tem is designed as a layered web application. The frontend is responsible for user interaction and form validation, while the backend handles business rules, security, persistence and transactional integrity. PostgreSQL acts as the central source of truth </w:t>
-      </w:r>
-      <w:r>
-        <w:t>for all warehouse, product, inventory and order data.</w:t>
+        <w:t>The system is designed as a layered web application. The frontend is responsible for user interaction and form validation, while the backend handles business rules, security, persistence and transactional integrity. PostgreSQL acts as the central source of truth for all warehouse, product, inventory and order data.</w:t>
       </w:r>
     </w:p>
     <w:p>
       <w:r>
-        <w:t>A layered design is used because it keeps the project clean. The user interface, business logic and database logic are separated from each other. This means that if the frontend design changes, the data</w:t>
-      </w:r>
-      <w:r>
-        <w:t>base code does not need to change. Similarly, if a database query changes, the user screens can remain mostly the same.</w:t>
+        <w:t>A layered design is used because it keeps the project clean. The user interface, business logic and database logic are separated from each other. This means that if the frontend design changes, the database code does not need to change. Similarly, if a database query changes, the user screens can remain mostly the same.</w:t>
       </w:r>
     </w:p>
     <w:p>
@@ -2291,10 +2192,7 @@
         <w:t xml:space="preserve">Design approach: </w:t>
       </w:r>
       <w:r>
-        <w:t>The application follows a common web architecture: React runs in the browser, Spring Boot runs on the server, and Postg</w:t>
-      </w:r>
-      <w:r>
-        <w:t>reSQL stores the data. The browser never talks directly to the database. It always talks to the backend API, which checks security and applies rules.</w:t>
+        <w:t>The application follows a common web architecture: React runs in the browser, Spring Boot runs on the server, and PostgreSQL stores the data. The browser never talks directly to the database. It always talks to the backend API, which checks security and applies rules.</w:t>
       </w:r>
     </w:p>
     <w:p>
@@ -2437,13 +2335,7 @@
               <w:rPr>
                 <w:sz w:val="18"/>
               </w:rPr>
-              <w:t>React.js, Vite, CSS, Lucide ic</w:t>
-            </w:r>
-            <w:r>
-              <w:rPr>
-                <w:sz w:val="18"/>
-              </w:rPr>
-              <w:t>ons</w:t>
+              <w:t>React.js, Vite, CSS, Lucide icons</w:t>
             </w:r>
           </w:p>
         </w:tc>
@@ -2567,13 +2459,7 @@
               <w:rPr>
                 <w:sz w:val="18"/>
               </w:rPr>
-              <w:t xml:space="preserve">Spring Services with </w:t>
-            </w:r>
-            <w:r>
-              <w:rPr>
-                <w:sz w:val="18"/>
-              </w:rPr>
-              <w:t>@Transactional</w:t>
+              <w:t>Spring Services with @Transactional</w:t>
             </w:r>
           </w:p>
         </w:tc>
@@ -2788,10 +2674,7 @@
     <w:p/>
     <w:p>
       <w:r>
-        <w:t xml:space="preserve">The architecture makes the system easier to </w:t>
-      </w:r>
-      <w:r>
-        <w:t>test and extend. For example, if a new report module is needed, a new React view and backend endpoint can be added without rewriting the whole application. The same database entities and repositories can be reused.</w:t>
+        <w:t>The architecture makes the system easier to test and extend. For example, if a new report module is needed, a new React view and backend endpoint can be added without rewriting the whole application. The same database entities and repositories can be reused.</w:t>
       </w:r>
     </w:p>
     <w:p>
@@ -2805,10 +2688,7 @@
         <w:spacing w:after="80"/>
       </w:pPr>
       <w:r>
-        <w:t>User logs in fro</w:t>
-      </w:r>
-      <w:r>
-        <w:t>m the React frontend.</w:t>
+        <w:t>User logs in from the React frontend.</w:t>
       </w:r>
     </w:p>
     <w:p>
@@ -2844,10 +2724,7 @@
         <w:spacing w:after="80"/>
       </w:pPr>
       <w:r>
-        <w:t>Service layer applie</w:t>
-      </w:r>
-      <w:r>
-        <w:t>s business rules inside a transaction.</w:t>
+        <w:t>Service layer applies business rules inside a transaction.</w:t>
       </w:r>
     </w:p>
     <w:p>
@@ -2974,13 +2851,7 @@
               <w:rPr>
                 <w:sz w:val="18"/>
               </w:rPr>
-              <w:t>Used to build a dynamic frontend where screens update wi</w:t>
-            </w:r>
-            <w:r>
-              <w:rPr>
-                <w:sz w:val="18"/>
-              </w:rPr>
-              <w:t>thout full page reloads.</w:t>
+              <w:t>Used to build a dynamic frontend where screens update without full page reloads.</w:t>
             </w:r>
           </w:p>
         </w:tc>
@@ -3106,13 +2977,7 @@
               <w:rPr>
                 <w:sz w:val="18"/>
               </w:rPr>
-              <w:t xml:space="preserve">Used to map Java classes to </w:t>
-            </w:r>
-            <w:r>
-              <w:rPr>
-                <w:sz w:val="18"/>
-              </w:rPr>
-              <w:t>database tables and reduce manual SQL code.</w:t>
+              <w:t>Used to map Java classes to database tables and reduce manual SQL code.</w:t>
             </w:r>
           </w:p>
         </w:tc>
@@ -3238,13 +3103,7 @@
               <w:rPr>
                 <w:sz w:val="18"/>
               </w:rPr>
-              <w:t>Used to test important</w:t>
-            </w:r>
-            <w:r>
-              <w:rPr>
-                <w:sz w:val="18"/>
-              </w:rPr>
-              <w:t xml:space="preserve"> backend services and protect the project from regressions.</w:t>
+              <w:t>Used to test important backend services and protect the project from regressions.</w:t>
             </w:r>
           </w:p>
         </w:tc>
@@ -3302,10 +3161,7 @@
         <w:t xml:space="preserve">Client-server communication: </w:t>
       </w:r>
       <w:r>
-        <w:t xml:space="preserve">The React application sends HTTP requests to Spring Boot </w:t>
-      </w:r>
-      <w:r>
-        <w:t>endpoints. The backend returns JSON data. This format is easy for the frontend to read and display in tables, forms and dashboards.</w:t>
+        <w:t>The React application sends HTTP requests to Spring Boot endpoints. The backend returns JSON data. This format is easy for the frontend to read and display in tables, forms and dashboards.</w:t>
       </w:r>
     </w:p>
     <w:p>
@@ -3317,34 +3173,26 @@
         <w:t xml:space="preserve">Security flow: </w:t>
       </w:r>
       <w:r>
-        <w:t>After login, the backend returns a JWT token. The frontend sends this token with every protected request. Spr</w:t>
-      </w:r>
-      <w:r>
-        <w:t>ing Security reads the token and decides whether the user is allowed to perform the requested action.</w:t>
+        <w:t>After login, the backend returns a JWT token. The frontend sends this token with every protected request. Spring Security reads the token and decides whether the user is allowed to perform the requested action.</w:t>
       </w:r>
     </w:p>
     <w:p>
       <w:pPr>
         <w:pStyle w:val="Heading2"/>
       </w:pPr>
+      <w:bookmarkStart w:id="0" w:name="_Hlk229659912"/>
       <w:r>
         <w:t>2.2 Database Design</w:t>
       </w:r>
     </w:p>
     <w:p>
       <w:r>
-        <w:t>The database is normalized around warehouse location, product catalog, inventory, procurement, users and customer orders. The key rela</w:t>
-      </w:r>
-      <w:r>
-        <w:t>tionship is the physical storage hierarchy: one warehouse contains many zones, one zone contains many aisles, and one aisle contains many storage bins.</w:t>
+        <w:t>The database is normalized around warehouse location, product catalog, inventory, procurement, users and customer orders. The key relationship is the physical storage hierarchy: one warehouse contains many zones, one zone contains many aisles, and one aisle contains many storage bins.</w:t>
       </w:r>
     </w:p>
     <w:p>
       <w:r>
-        <w:t>Database design is important in this project because inventory data must be accurate. If the database al</w:t>
-      </w:r>
-      <w:r>
-        <w:t>lows wrong or duplicate data, the warehouse staff may pick the wrong item or accept an order without enough stock. For this reason, the design uses primary keys, foreign keys, unique fields and transaction-safe updates.</w:t>
+        <w:t>Database design is important in this project because inventory data must be accurate. If the database allows wrong or duplicate data, the warehouse staff may pick the wrong item or accept an order without enough stock. For this reason, the design uses primary keys, foreign keys, unique fields and transaction-safe updates.</w:t>
       </w:r>
     </w:p>
     <w:tbl>
@@ -3452,13 +3300,7 @@
               <w:rPr>
                 <w:sz w:val="18"/>
               </w:rPr>
-              <w:t xml:space="preserve">Stores </w:t>
-            </w:r>
-            <w:r>
-              <w:rPr>
-                <w:sz w:val="18"/>
-              </w:rPr>
-              <w:t>warehouse code, name, address/location and active status.</w:t>
+              <w:t>Stores warehouse code, name, address/location and active status.</w:t>
             </w:r>
           </w:p>
         </w:tc>
@@ -3584,13 +3426,7 @@
               <w:rPr>
                 <w:sz w:val="18"/>
               </w:rPr>
-              <w:t xml:space="preserve">Stores bin code, capacity, current </w:t>
-            </w:r>
-            <w:r>
-              <w:rPr>
-                <w:sz w:val="18"/>
-              </w:rPr>
-              <w:t>occupancy, active flag and status.</w:t>
+              <w:t>Stores bin code, capacity, current occupancy, active flag and status.</w:t>
             </w:r>
           </w:p>
         </w:tc>
@@ -3717,13 +3553,7 @@
               <w:rPr>
                 <w:sz w:val="18"/>
               </w:rPr>
-              <w:t>Stores product quantity by storage</w:t>
-            </w:r>
-            <w:r>
-              <w:rPr>
-                <w:sz w:val="18"/>
-              </w:rPr>
-              <w:t xml:space="preserve"> bin, batch number, expiry date and reserved quantity.</w:t>
+              <w:t>Stores product quantity by storage bin, batch number, expiry date and reserved quantity.</w:t>
             </w:r>
           </w:p>
         </w:tc>
@@ -3849,13 +3679,7 @@
               <w:rPr>
                 <w:sz w:val="18"/>
               </w:rPr>
-              <w:t xml:space="preserve">Stores ordered </w:t>
-            </w:r>
-            <w:r>
-              <w:rPr>
-                <w:sz w:val="18"/>
-              </w:rPr>
-              <w:t>products and requested quantities.</w:t>
+              <w:t>Stores ordered products and requested quantities.</w:t>
             </w:r>
           </w:p>
         </w:tc>
@@ -4023,13 +3847,7 @@
               <w:rPr>
                 <w:sz w:val="18"/>
               </w:rPr>
-              <w:t>Stores</w:t>
-            </w:r>
-            <w:r>
-              <w:rPr>
-                <w:sz w:val="18"/>
-              </w:rPr>
-              <w:t xml:space="preserve"> application users, roles, status, contact details and password hashes.</w:t>
+              <w:t>Stores application users, roles, status, contact details and password hashes.</w:t>
             </w:r>
           </w:p>
         </w:tc>
@@ -4038,10 +3856,7 @@
     <w:p/>
     <w:p>
       <w:r>
-        <w:t>The inventory_items table stores the current stock position, while inventory_transactions stores the history of stock movement. This is useful because the system can show both the pr</w:t>
-      </w:r>
-      <w:r>
-        <w:t>esent quantity and the reason behind past changes. For example, a RECEIVE transaction increases stock and a PICK transaction decreases stock.</w:t>
+        <w:t>The inventory_items table stores the current stock position, while inventory_transactions stores the history of stock movement. This is useful because the system can show both the present quantity and the reason behind past changes. For example, a RECEIVE transaction increases stock and a PICK transaction decreases stock.</w:t>
       </w:r>
     </w:p>
     <w:tbl>
@@ -4218,13 +4033,7 @@
               <w:rPr>
                 <w:sz w:val="18"/>
               </w:rPr>
-              <w:t xml:space="preserve">Zone -&gt; </w:t>
-            </w:r>
-            <w:r>
-              <w:rPr>
-                <w:sz w:val="18"/>
-              </w:rPr>
-              <w:t>Aisle</w:t>
+              <w:t>Zone -&gt; Aisle</w:t>
             </w:r>
           </w:p>
         </w:tc>
@@ -4574,13 +4383,7 @@
               <w:rPr>
                 <w:sz w:val="18"/>
               </w:rPr>
-              <w:t xml:space="preserve">A purchase order can contain </w:t>
-            </w:r>
-            <w:r>
-              <w:rPr>
-                <w:sz w:val="18"/>
-              </w:rPr>
-              <w:t>multiple product lines.</w:t>
+              <w:t>A purchase order can contain multiple product lines.</w:t>
             </w:r>
           </w:p>
         </w:tc>
@@ -4735,13 +4538,7 @@
               <w:rPr>
                 <w:sz w:val="18"/>
               </w:rPr>
-              <w:t xml:space="preserve">A reference from one table to another, such as product_id in </w:t>
-            </w:r>
-            <w:r>
-              <w:rPr>
-                <w:sz w:val="18"/>
-              </w:rPr>
-              <w:t>inventory_items.</w:t>
+              <w:t>A reference from one table to another, such as product_id in inventory_items.</w:t>
             </w:r>
           </w:p>
         </w:tc>
@@ -4867,13 +4664,7 @@
               <w:rPr>
                 <w:sz w:val="18"/>
               </w:rPr>
-              <w:t xml:space="preserve">A database reliability concept that helps keep </w:t>
-            </w:r>
-            <w:r>
-              <w:rPr>
-                <w:sz w:val="18"/>
-              </w:rPr>
-              <w:t>inventory data correct.</w:t>
+              <w:t>A database reliability concept that helps keep inventory data correct.</w:t>
             </w:r>
           </w:p>
         </w:tc>
@@ -4931,10 +4722,7 @@
         <w:t xml:space="preserve">Why PostgreSQL: </w:t>
       </w:r>
       <w:r>
-        <w:t>PostgreSQL is suitable for this system because warehouse data is strongly relational. Products are linked to categories, invento</w:t>
-      </w:r>
-      <w:r>
-        <w:t>ry is linked to products and bins, and orders are linked to order lines. PostgreSQL handles these relationships safely.</w:t>
+        <w:t>PostgreSQL is suitable for this system because warehouse data is strongly relational. Products are linked to categories, inventory is linked to products and bins, and orders are linked to order lines. PostgreSQL handles these relationships safely.</w:t>
       </w:r>
     </w:p>
     <w:p>
@@ -4946,10 +4734,7 @@
         <w:t xml:space="preserve">Why JPA/Hibernate: </w:t>
       </w:r>
       <w:r>
-        <w:t>JPA and Hibernate allow developers to work with Java objects instead of writing SQL for every operation. This keeps t</w:t>
-      </w:r>
-      <w:r>
-        <w:t>he backend code cleaner and helps prevent common SQL mistakes.</w:t>
+        <w:t>JPA and Hibernate allow developers to work with Java objects instead of writing SQL for every operation. This keeps the backend code cleaner and helps prevent common SQL mistakes.</w:t>
       </w:r>
     </w:p>
     <w:p>
@@ -4957,6 +4742,7 @@
         <w:t>Figure 1: Warehouse Management System ERD</w:t>
       </w:r>
     </w:p>
+    <w:bookmarkEnd w:id="0"/>
     <w:p>
       <w:pPr>
         <w:jc w:val="center"/>
@@ -5013,10 +4799,7 @@
     </w:p>
     <w:p>
       <w:r>
-        <w:t xml:space="preserve">The following table definitions show the database design in field-wise format. Each table includes the field name, </w:t>
-      </w:r>
-      <w:r>
-        <w:t>expected data type, key/index information and a simple description. The format is kept similar to the college black book table style.</w:t>
+        <w:t>The following table definitions show the database design in field-wise format. Each table includes the field name, expected data type, key/index information and a simple description. The format is kept similar to the college black book table style.</w:t>
       </w:r>
     </w:p>
     <w:p>
@@ -5226,13 +5009,7 @@
               <w:rPr>
                 <w:sz w:val="16"/>
               </w:rPr>
-              <w:t xml:space="preserve">Unique warehouse </w:t>
-            </w:r>
-            <w:r>
-              <w:rPr>
-                <w:sz w:val="16"/>
-              </w:rPr>
-              <w:t>record id.</w:t>
+              <w:t>Unique warehouse record id.</w:t>
             </w:r>
           </w:p>
         </w:tc>
@@ -5939,13 +5716,7 @@
               <w:rPr>
                 <w:sz w:val="16"/>
               </w:rPr>
-              <w:t xml:space="preserve">References the warehouse where the zone </w:t>
-            </w:r>
-            <w:r>
-              <w:rPr>
-                <w:sz w:val="16"/>
-              </w:rPr>
-              <w:t>belongs.</w:t>
+              <w:t>References the warehouse where the zone belongs.</w:t>
             </w:r>
           </w:p>
         </w:tc>
@@ -6323,13 +6094,7 @@
               <w:rPr>
                 <w:sz w:val="16"/>
               </w:rPr>
-              <w:t xml:space="preserve">References the zone </w:t>
-            </w:r>
-            <w:r>
-              <w:rPr>
-                <w:sz w:val="16"/>
-              </w:rPr>
-              <w:t>where the aisle belongs.</w:t>
+              <w:t>References the zone where the aisle belongs.</w:t>
             </w:r>
           </w:p>
         </w:tc>
@@ -6953,13 +6718,7 @@
               <w:rPr>
                 <w:sz w:val="16"/>
               </w:rPr>
-              <w:t>Bin status such as AVAILABLE, FULL or I</w:t>
-            </w:r>
-            <w:r>
-              <w:rPr>
-                <w:sz w:val="16"/>
-              </w:rPr>
-              <w:t>NACTIVE.</w:t>
+              <w:t>Bin status such as AVAILABLE, FULL or INACTIVE.</w:t>
             </w:r>
           </w:p>
         </w:tc>
@@ -7584,13 +7343,7 @@
               <w:rPr>
                 <w:sz w:val="16"/>
               </w:rPr>
-              <w:t xml:space="preserve">Shows whether the category is </w:t>
-            </w:r>
-            <w:r>
-              <w:rPr>
-                <w:sz w:val="16"/>
-              </w:rPr>
-              <w:t>active.</w:t>
+              <w:t>Shows whether the category is active.</w:t>
             </w:r>
           </w:p>
         </w:tc>
@@ -8214,13 +7967,7 @@
               <w:rPr>
                 <w:sz w:val="16"/>
               </w:rPr>
-              <w:t xml:space="preserve">Stock keeping unit </w:t>
-            </w:r>
-            <w:r>
-              <w:rPr>
-                <w:sz w:val="16"/>
-              </w:rPr>
-              <w:t>used to identify product.</w:t>
+              <w:t>Stock keeping unit used to identify product.</w:t>
             </w:r>
           </w:p>
         </w:tc>
@@ -8548,13 +8295,7 @@
               <w:rPr>
                 <w:sz w:val="16"/>
               </w:rPr>
-              <w:t xml:space="preserve">Capacity units consumed by one </w:t>
-            </w:r>
-            <w:r>
-              <w:rPr>
-                <w:sz w:val="16"/>
-              </w:rPr>
-              <w:t>product item.</w:t>
+              <w:t>Capacity units consumed by one product item.</w:t>
             </w:r>
           </w:p>
         </w:tc>
@@ -9917,13 +9658,7 @@
               <w:rPr>
                 <w:sz w:val="16"/>
               </w:rPr>
-              <w:t xml:space="preserve">Date and </w:t>
-            </w:r>
-            <w:r>
-              <w:rPr>
-                <w:sz w:val="16"/>
-              </w:rPr>
-              <w:t>time when stock row was created.</w:t>
+              <w:t>Date and time when stock row was created.</w:t>
             </w:r>
           </w:p>
         </w:tc>
@@ -10805,10 +10540,7 @@
         <w:pStyle w:val="Heading3"/>
       </w:pPr>
       <w:r>
-        <w:t xml:space="preserve">2.2.9 </w:t>
-      </w:r>
-      <w:r>
-        <w:t>Customer Order Table (customer_orders)</w:t>
+        <w:t>2.2.9 Customer Order Table (customer_orders)</w:t>
       </w:r>
     </w:p>
     <w:tbl>
@@ -11175,13 +10907,7 @@
               <w:rPr>
                 <w:sz w:val="16"/>
               </w:rPr>
-              <w:t xml:space="preserve">Order status such as </w:t>
-            </w:r>
-            <w:r>
-              <w:rPr>
-                <w:sz w:val="16"/>
-              </w:rPr>
-              <w:t>PENDING, PICKING, PACKED or SHIPPED.</w:t>
+              <w:t>Order status such as PENDING, PICKING, PACKED or SHIPPED.</w:t>
             </w:r>
           </w:p>
         </w:tc>
@@ -12429,13 +12155,7 @@
               <w:rPr>
                 <w:sz w:val="16"/>
               </w:rPr>
-              <w:t xml:space="preserve">Date and time when supplier was </w:t>
-            </w:r>
-            <w:r>
-              <w:rPr>
-                <w:sz w:val="16"/>
-              </w:rPr>
-              <w:t>created.</w:t>
+              <w:t>Date and time when supplier was created.</w:t>
             </w:r>
           </w:p>
         </w:tc>
@@ -13766,13 +13486,7 @@
               <w:rPr>
                 <w:sz w:val="16"/>
               </w:rPr>
-              <w:t xml:space="preserve">Unique purchase order item </w:t>
-            </w:r>
-            <w:r>
-              <w:rPr>
-                <w:sz w:val="16"/>
-              </w:rPr>
-              <w:t>id.</w:t>
+              <w:t>Unique purchase order item id.</w:t>
             </w:r>
           </w:p>
         </w:tc>
@@ -14030,10 +13744,7 @@
         <w:pStyle w:val="Heading3"/>
       </w:pPr>
       <w:r>
-        <w:t xml:space="preserve">2.2.14 Application User Table </w:t>
-      </w:r>
-      <w:r>
-        <w:t>(app_users)</w:t>
+        <w:t>2.2.14 Application User Table (app_users)</w:t>
       </w:r>
     </w:p>
     <w:tbl>
@@ -14481,13 +14192,7 @@
               <w:rPr>
                 <w:sz w:val="16"/>
               </w:rPr>
-              <w:t xml:space="preserve">Date and </w:t>
-            </w:r>
-            <w:r>
-              <w:rPr>
-                <w:sz w:val="16"/>
-              </w:rPr>
-              <w:t>time when user was updated.</w:t>
+              <w:t>Date and time when user was updated.</w:t>
             </w:r>
           </w:p>
         </w:tc>
@@ -15085,18 +14790,12 @@
     </w:p>
     <w:p>
       <w:r>
-        <w:t xml:space="preserve">Implementation is divided into frontend, backend and integration work. </w:t>
-      </w:r>
-      <w:r>
-        <w:t>The codebase contains a Spring Boot backend under the backend folder and a React/Vite frontend under the frontend folder.</w:t>
+        <w:t>Implementation is divided into frontend, backend and integration work. The codebase contains a Spring Boot backend under the backend folder and a React/Vite frontend under the frontend folder.</w:t>
       </w:r>
     </w:p>
     <w:p>
       <w:r>
-        <w:t>The implementation is done in a practical way so that each module can be understood separately. The frontend focuses on screens and us</w:t>
-      </w:r>
-      <w:r>
-        <w:t>er actions. The backend focuses on validation, security and business rules. The database stores the final data permanently.</w:t>
+        <w:t>The implementation is done in a practical way so that each module can be understood separately. The frontend focuses on screens and user actions. The backend focuses on validation, security and business rules. The database stores the final data permanently.</w:t>
       </w:r>
     </w:p>
     <w:p>
@@ -15109,18 +14808,12 @@
     </w:p>
     <w:p>
       <w:r>
-        <w:t xml:space="preserve">The frontend is implemented using React.js and Vite. It provides a dashboard-style interface for warehouse </w:t>
-      </w:r>
-      <w:r>
-        <w:t>operators and administrators. The UI is organized into modules such as login, dashboard, warehouses, products, receiving, inventory, orders, procurement and users.</w:t>
+        <w:t>The frontend is implemented using React.js and Vite. It provides a dashboard-style interface for warehouse operators and administrators. The UI is organized into modules such as login, dashboard, warehouses, products, receiving, inventory, orders, procurement and users.</w:t>
       </w:r>
     </w:p>
     <w:p>
       <w:r>
-        <w:t>React was selected because it is component-based. A component is a reusable part of the scre</w:t>
-      </w:r>
-      <w:r>
-        <w:t>en, such as a form, table, tab or button. This makes the interface easier to maintain because the same style and behavior can be reused in different places.</w:t>
+        <w:t>React was selected because it is component-based. A component is a reusable part of the screen, such as a form, table, tab or button. This makes the interface easier to maintain because the same style and behavior can be reused in different places.</w:t>
       </w:r>
     </w:p>
     <w:tbl>
@@ -15228,13 +14921,7 @@
               <w:rPr>
                 <w:sz w:val="18"/>
               </w:rPr>
-              <w:t xml:space="preserve">Collects username/password and stores the JWT token for API </w:t>
-            </w:r>
-            <w:r>
-              <w:rPr>
-                <w:sz w:val="18"/>
-              </w:rPr>
-              <w:t>calls.</w:t>
+              <w:t>Collects username/password and stores the JWT token for API calls.</w:t>
             </w:r>
           </w:p>
         </w:tc>
@@ -15402,13 +15089,7 @@
               <w:rPr>
                 <w:sz w:val="18"/>
               </w:rPr>
-              <w:t>Receives stock in</w:t>
-            </w:r>
-            <w:r>
-              <w:rPr>
-                <w:sz w:val="18"/>
-              </w:rPr>
-              <w:t>to the system and triggers putaway logic.</w:t>
+              <w:t>Receives stock into the system and triggers putaway logic.</w:t>
             </w:r>
           </w:p>
         </w:tc>
@@ -15585,18 +15266,12 @@
     <w:p/>
     <w:p>
       <w:r>
-        <w:t>Form-level validation is used to reduce invalid submissions. Examples include required fields, positive numeric quantities, SKU/barcode format patterns, email format validation, password length rules and role/</w:t>
-      </w:r>
-      <w:r>
-        <w:t>status selection.</w:t>
+        <w:t>Form-level validation is used to reduce invalid submissions. Examples include required fields, positive numeric quantities, SKU/barcode format patterns, email format validation, password length rules and role/status selection.</w:t>
       </w:r>
     </w:p>
     <w:p>
       <w:r>
-        <w:t>The frontend stores the login token after a successful login. When the user opens protected screens, the token is sent to the backend in the Authorization header. If the token is missing or invalid, the backend refuses the request. This k</w:t>
-      </w:r>
-      <w:r>
-        <w:t>eeps warehouse data protected from unauthorized access.</w:t>
+        <w:t>The frontend stores the login token after a successful login. When the user opens protected screens, the token is sent to the backend in the Authorization header. If the token is missing or invalid, the backend refuses the request. This keeps warehouse data protected from unauthorized access.</w:t>
       </w:r>
     </w:p>
     <w:tbl>
@@ -15747,13 +15422,7 @@
               <w:rPr>
                 <w:sz w:val="18"/>
               </w:rPr>
-              <w:t xml:space="preserve">Quantity, capacity, price and weight must be </w:t>
-            </w:r>
-            <w:r>
-              <w:rPr>
-                <w:sz w:val="18"/>
-              </w:rPr>
-              <w:t>valid positive values.</w:t>
+              <w:t>Quantity, capacity, price and weight must be valid positive values.</w:t>
             </w:r>
           </w:p>
         </w:tc>
@@ -15879,13 +15548,7 @@
               <w:rPr>
                 <w:sz w:val="18"/>
               </w:rPr>
-              <w:t>Errors returned by the backend are shown</w:t>
-            </w:r>
-            <w:r>
-              <w:rPr>
-                <w:sz w:val="18"/>
-              </w:rPr>
-              <w:t xml:space="preserve"> to the user so the issue can be corrected.</w:t>
+              <w:t>Errors returned by the backend are shown to the user so the issue can be corrected.</w:t>
             </w:r>
           </w:p>
         </w:tc>
@@ -15901,10 +15564,7 @@
         <w:t xml:space="preserve">User experience: </w:t>
       </w:r>
       <w:r>
-        <w:t xml:space="preserve">The interface is designed for regular warehouse work. The main modules are available as tabs, and forms are kept simple so users can quickly complete common operations like receiving stock or </w:t>
-      </w:r>
-      <w:r>
-        <w:t>processing orders.</w:t>
+        <w:t>The interface is designed for regular warehouse work. The main modules are available as tabs, and forms are kept simple so users can quickly complete common operations like receiving stock or processing orders.</w:t>
       </w:r>
     </w:p>
     <w:p>
@@ -15917,18 +15577,12 @@
     </w:p>
     <w:p>
       <w:r>
-        <w:t>The backend is a Spring Boot 3 application. It uses controllers for REST endpoints, DTO records for request and response data, services for business logic, repositories for persistence and entities for database ma</w:t>
-      </w:r>
-      <w:r>
-        <w:t>pping.</w:t>
+        <w:t>The backend is a Spring Boot 3 application. It uses controllers for REST endpoints, DTO records for request and response data, services for business logic, repositories for persistence and entities for database mapping.</w:t>
       </w:r>
     </w:p>
     <w:p>
       <w:r>
-        <w:t>Spring Boot reduces boilerplate code and gives the application an embedded server. Because of this, the backend can be started easily from the command line. The backend also provides a clear package structure so that controllers, services, repositor</w:t>
-      </w:r>
-      <w:r>
-        <w:t>ies, domain classes and security classes are easy to find.</w:t>
+        <w:t>Spring Boot reduces boilerplate code and gives the application an embedded server. Because of this, the backend can be started easily from the command line. The backend also provides a clear package structure so that controllers, services, repositories, domain classes and security classes are easy to find.</w:t>
       </w:r>
     </w:p>
     <w:tbl>
@@ -16581,10 +16235,7 @@
         <w:spacing w:after="80"/>
       </w:pPr>
       <w:r>
-        <w:t>GlobalExceptionHandler converts validation, duplicate resource and insuffic</w:t>
-      </w:r>
-      <w:r>
-        <w:t>ient stock errors into clean API responses.</w:t>
+        <w:t>GlobalExceptionHandler converts validation, duplicate resource and insufficient stock errors into clean API responses.</w:t>
       </w:r>
     </w:p>
     <w:p>
@@ -16794,13 +16445,7 @@
               <w:rPr>
                 <w:sz w:val="18"/>
               </w:rPr>
-              <w:t>Contains business logic such as receiving stock, packing orders and mana</w:t>
-            </w:r>
-            <w:r>
-              <w:rPr>
-                <w:sz w:val="18"/>
-              </w:rPr>
-              <w:t>ging users.</w:t>
+              <w:t>Contains business logic such as receiving stock, packing orders and managing users.</w:t>
             </w:r>
           </w:p>
         </w:tc>
@@ -16968,13 +16613,7 @@
               <w:rPr>
                 <w:sz w:val="18"/>
               </w:rPr>
-              <w:t xml:space="preserve">Contains custom </w:t>
-            </w:r>
-            <w:r>
-              <w:rPr>
-                <w:sz w:val="18"/>
-              </w:rPr>
-              <w:t>exceptions such as InsufficientStockException.</w:t>
+              <w:t>Contains custom exceptions such as InsufficientStockException.</w:t>
             </w:r>
           </w:p>
         </w:tc>
@@ -17032,10 +16671,7 @@
         <w:t xml:space="preserve">Receiving logic: </w:t>
       </w:r>
       <w:r>
-        <w:t>When stock is received, the backend first checks the product, finds a storage bin with enough capacity, locks the required row</w:t>
-      </w:r>
-      <w:r>
-        <w:t>s, updates inventory, updates bin capacity and records an inventory transaction.</w:t>
+        <w:t>When stock is received, the backend first checks the product, finds a storage bin with enough capacity, locks the required rows, updates inventory, updates bin capacity and records an inventory transaction.</w:t>
       </w:r>
     </w:p>
     <w:p>
@@ -17047,10 +16683,7 @@
         <w:t xml:space="preserve">Order logic: </w:t>
       </w:r>
       <w:r>
-        <w:t>When an order is packed, the backend checks available inventory. If stock is available, it decreases quantity and records the movement. If stock is not enough, th</w:t>
-      </w:r>
-      <w:r>
-        <w:t>e operation fails and previous changes are rolled back.</w:t>
+        <w:t>When an order is packed, the backend checks available inventory. If stock is available, it decreases quantity and records the movement. If stock is not enough, the operation fails and previous changes are rolled back.</w:t>
       </w:r>
     </w:p>
     <w:p>
@@ -17075,19 +16708,13 @@
     </w:p>
     <w:p>
       <w:r>
-        <w:t xml:space="preserve">Integration is handled </w:t>
-      </w:r>
-      <w:r>
-        <w:t>through JSON-based REST APIs. The frontend sends requests to the backend using the configured base API URL. In local development, the frontend runs on port 5173 and the backend local profile runs on port 8081.</w:t>
+        <w:t>Integration is handled through JSON-based REST APIs. The frontend sends requests to the backend using the configured base API URL. In local development, the frontend runs on port 5173 and the backend local profile runs on port 8081.</w:t>
       </w:r>
     </w:p>
     <w:p>
       <w:r>
         <w:lastRenderedPageBreak/>
-        <w:t>The integration between frontend and backend i</w:t>
-      </w:r>
-      <w:r>
-        <w:t>s important because the React application is only a user interface. The actual data is stored and processed by the backend. Every create, update or view action from the frontend becomes an API request to Spring Boot.</w:t>
+        <w:t>The integration between frontend and backend is important because the React application is only a user interface. The actual data is stored and processed by the backend. Every create, update or view action from the frontend becomes an API request to Spring Boot.</w:t>
       </w:r>
     </w:p>
     <w:tbl>
@@ -17363,13 +16990,7 @@
               <w:rPr>
                 <w:sz w:val="18"/>
               </w:rPr>
-              <w:t xml:space="preserve">Swagger UI available when backend runs on the configured backend </w:t>
-            </w:r>
-            <w:r>
-              <w:rPr>
-                <w:sz w:val="18"/>
-              </w:rPr>
-              <w:t>port.</w:t>
+              <w:t>Swagger UI available when backend runs on the configured backend port.</w:t>
             </w:r>
           </w:p>
         </w:tc>
@@ -17440,10 +17061,7 @@
         <w:spacing w:after="80"/>
       </w:pPr>
       <w:r>
-        <w:t>Receive inbound stock</w:t>
-      </w:r>
-      <w:r>
-        <w:t xml:space="preserve"> with POST /api/inventory/receive.</w:t>
+        <w:t>Receive inbound stock with POST /api/inventory/receive.</w:t>
       </w:r>
     </w:p>
     <w:p>
@@ -17611,13 +17229,7 @@
               <w:rPr>
                 <w:sz w:val="18"/>
               </w:rPr>
-              <w:t xml:space="preserve">Used to expose backend </w:t>
-            </w:r>
-            <w:r>
-              <w:rPr>
-                <w:sz w:val="18"/>
-              </w:rPr>
-              <w:t>operations through URLs and HTTP methods.</w:t>
+              <w:t>Used to expose backend operations through URLs and HTTP methods.</w:t>
             </w:r>
           </w:p>
         </w:tc>
@@ -17743,13 +17355,7 @@
               <w:rPr>
                 <w:sz w:val="18"/>
               </w:rPr>
-              <w:t>Used for database URL, database usernam</w:t>
-            </w:r>
-            <w:r>
-              <w:rPr>
-                <w:sz w:val="18"/>
-              </w:rPr>
-              <w:t>e, password and JWT secret.</w:t>
+              <w:t>Used for database URL, database username, password and JWT secret.</w:t>
             </w:r>
           </w:p>
         </w:tc>
@@ -17800,10 +17406,7 @@
     <w:p/>
     <w:p>
       <w:r>
-        <w:t xml:space="preserve">This integration style is flexible because different frontends can use the same backend later. For example, a mobile app for floor </w:t>
-      </w:r>
-      <w:r>
-        <w:t>operators could call the same inventory and order APIs in the future.</w:t>
+        <w:t>This integration style is flexible because different frontends can use the same backend later. For example, a mobile app for floor operators could call the same inventory and order APIs in the future.</w:t>
       </w:r>
     </w:p>
     <w:p>
@@ -17822,18 +17425,12 @@
     </w:p>
     <w:p>
       <w:r>
-        <w:t>Testing verifies that the system works according to the requirement document. The project uses automated backend tests, frontend production build validation and manu</w:t>
-      </w:r>
-      <w:r>
-        <w:t>al user acceptance flows through the browser.</w:t>
+        <w:t>Testing verifies that the system works according to the requirement document. The project uses automated backend tests, frontend production build validation and manual user acceptance flows through the browser.</w:t>
       </w:r>
     </w:p>
     <w:p>
       <w:r>
-        <w:t xml:space="preserve">Testing is very important for a warehouse system because wrong stock data can create real business problems. If receiving, packing or order status logic fails, the warehouse may show incorrect quantity or ship </w:t>
-      </w:r>
-      <w:r>
-        <w:t>the wrong items. For this reason, the project checks both normal cases and error cases.</w:t>
+        <w:t>Testing is very important for a warehouse system because wrong stock data can create real business problems. If receiving, packing or order status logic fails, the warehouse may show incorrect quantity or ship the wrong items. For this reason, the project checks both normal cases and error cases.</w:t>
       </w:r>
     </w:p>
     <w:tbl>
@@ -17983,13 +17580,7 @@
               <w:rPr>
                 <w:sz w:val="18"/>
               </w:rPr>
-              <w:t xml:space="preserve">Checks </w:t>
-            </w:r>
-            <w:r>
-              <w:rPr>
-                <w:sz w:val="18"/>
-              </w:rPr>
-              <w:t>whether Spring Boot, JPA repositories and the test database work together.</w:t>
+              <w:t>Checks whether Spring Boot, JPA repositories and the test database work together.</w:t>
             </w:r>
           </w:p>
         </w:tc>
@@ -18073,13 +17664,7 @@
               <w:rPr>
                 <w:sz w:val="18"/>
               </w:rPr>
-              <w:t>Checks whether protected APIs require log</w:t>
-            </w:r>
-            <w:r>
-              <w:rPr>
-                <w:sz w:val="18"/>
-              </w:rPr>
-              <w:t>in and admin-only operations are restricted.</w:t>
+              <w:t>Checks whether protected APIs require login and admin-only operations are restricted.</w:t>
             </w:r>
           </w:p>
         </w:tc>
@@ -18175,10 +17760,7 @@
         <w:pStyle w:val="Heading2"/>
       </w:pPr>
       <w:r>
-        <w:t>4.1 Test Cas</w:t>
-      </w:r>
-      <w:r>
-        <w:t>es</w:t>
+        <w:t>4.1 Test Cases</w:t>
       </w:r>
     </w:p>
     <w:p/>
@@ -18788,13 +18370,7 @@
               <w:rPr>
                 <w:sz w:val="14"/>
               </w:rPr>
-              <w:t xml:space="preserve">Bin </w:t>
-            </w:r>
-            <w:r>
-              <w:rPr>
-                <w:sz w:val="14"/>
-              </w:rPr>
-              <w:t>creation</w:t>
+              <w:t>Bin creation</w:t>
             </w:r>
           </w:p>
         </w:tc>
@@ -19018,13 +18594,7 @@
               <w:rPr>
                 <w:sz w:val="14"/>
               </w:rPr>
-              <w:t xml:space="preserve">Receive </w:t>
-            </w:r>
-            <w:r>
-              <w:rPr>
-                <w:sz w:val="14"/>
-              </w:rPr>
-              <w:t>product quantity against a reference.</w:t>
+              <w:t>Receive product quantity against a reference.</w:t>
             </w:r>
           </w:p>
         </w:tc>
@@ -19208,13 +18778,7 @@
               <w:rPr>
                 <w:sz w:val="14"/>
               </w:rPr>
-              <w:t xml:space="preserve">Order packing </w:t>
-            </w:r>
-            <w:r>
-              <w:rPr>
-                <w:sz w:val="14"/>
-              </w:rPr>
-              <w:t>without stock</w:t>
+              <w:t>Order packing without stock</w:t>
             </w:r>
           </w:p>
         </w:tc>
@@ -19398,13 +18962,7 @@
               <w:rPr>
                 <w:sz w:val="14"/>
               </w:rPr>
-              <w:t>T</w:t>
-            </w:r>
-            <w:r>
-              <w:rPr>
-                <w:sz w:val="14"/>
-              </w:rPr>
-              <w:t>C-11</w:t>
+              <w:t>TC-11</w:t>
             </w:r>
           </w:p>
         </w:tc>
@@ -19595,10 +19153,7 @@
     <w:p/>
     <w:p>
       <w:r>
-        <w:t xml:space="preserve">The test cases cover master data, business transactions, negative scenarios and </w:t>
-      </w:r>
-      <w:r>
-        <w:t>security behavior. Negative testing is especially useful because it proves that the system does not silently accept wrong data.</w:t>
+        <w:t>The test cases cover master data, business transactions, negative scenarios and security behavior. Negative testing is especially useful because it proves that the system does not silently accept wrong data.</w:t>
       </w:r>
     </w:p>
     <w:tbl>
@@ -19733,13 +19288,7 @@
               <w:rPr>
                 <w:sz w:val="16"/>
               </w:rPr>
-              <w:t xml:space="preserve">Logs in as admin, reviews inventory, manages </w:t>
-            </w:r>
-            <w:r>
-              <w:rPr>
-                <w:sz w:val="16"/>
-              </w:rPr>
-              <w:t>products, suppliers and users.</w:t>
+              <w:t>Logs in as admin, reviews inventory, manages products, suppliers and users.</w:t>
             </w:r>
           </w:p>
         </w:tc>
@@ -19843,13 +19392,7 @@
               <w:rPr>
                 <w:sz w:val="16"/>
               </w:rPr>
-              <w:t>Order Processing Use</w:t>
-            </w:r>
-            <w:r>
-              <w:rPr>
-                <w:sz w:val="16"/>
-              </w:rPr>
-              <w:t>r</w:t>
+              <w:t>Order Processing User</w:t>
             </w:r>
           </w:p>
         </w:tc>
@@ -19951,13 +19494,7 @@
               <w:rPr>
                 <w:sz w:val="16"/>
               </w:rPr>
-              <w:t xml:space="preserve">System is running and </w:t>
-            </w:r>
-            <w:r>
-              <w:rPr>
-                <w:sz w:val="16"/>
-              </w:rPr>
-              <w:t>database tables contain expected records.</w:t>
+              <w:t>System is running and database tables contain expected records.</w:t>
             </w:r>
           </w:p>
         </w:tc>
@@ -20325,18 +19862,12 @@
     <w:p/>
     <w:p>
       <w:r>
-        <w:t>User acceptance testing confirms that a warehouse manager can log in, manage products, receive stock, view inventory and process orders. The project also includes CI workflow configuration so tests and frontend build can be executed automatically on GitHu</w:t>
-      </w:r>
-      <w:r>
-        <w:t>b.</w:t>
+        <w:t>User acceptance testing confirms that a warehouse manager can log in, manage products, receive stock, view inventory and process orders. The project also includes CI workflow configuration so tests and frontend build can be executed automatically on GitHub.</w:t>
       </w:r>
     </w:p>
     <w:p>
       <w:r>
-        <w:t>The testing result shows that the main project flow is working. The backend tests prove that receiving stock and order rollback logic work correctly. The frontend build proves that the React application can be packaged without syntax or dependency error</w:t>
-      </w:r>
-      <w:r>
-        <w:t>s.</w:t>
+        <w:t>The testing result shows that the main project flow is working. The backend tests prove that receiving stock and order rollback logic work correctly. The frontend build proves that the React application can be packaged without syntax or dependency errors.</w:t>
       </w:r>
     </w:p>
     <w:p>
@@ -20369,37 +19900,25 @@
       <w:pPr>
         <w:pStyle w:val="Heading2"/>
       </w:pPr>
-      <w:bookmarkStart w:id="0" w:name="_Hlk229504623"/>
       <w:bookmarkStart w:id="1" w:name="_Hlk229504712"/>
+      <w:bookmarkStart w:id="2" w:name="_Hlk229504623"/>
       <w:r>
         <w:t>5.1 Summary</w:t>
       </w:r>
     </w:p>
     <w:p>
       <w:r>
-        <w:t>The Advanced Warehou</w:t>
-      </w:r>
-      <w:r>
-        <w:t>se Management System successfully implements the core requirements of the Enterprise Warehouse Management System project brief. It provides a complete web application with React frontend, Spring Boot backend, PostgreSQL database, JWT security, warehouse hi</w:t>
-      </w:r>
-      <w:r>
-        <w:t>erarchy, receiving and putaway, inventory tracking, QR code generation, order fulfillment and testing support.</w:t>
+        <w:t>The Advanced Warehouse Management System successfully implements the core requirements of the Enterprise Warehouse Management System project brief. It provides a complete web application with React frontend, Spring Boot backend, PostgreSQL database, JWT security, warehouse hierarchy, receiving and putaway, inventory tracking, QR code generation, order fulfillment and testing support.</w:t>
       </w:r>
     </w:p>
     <w:p>
       <w:r>
-        <w:t xml:space="preserve">The project improves warehouse accuracy by replacing manual stock tracking with transaction-safe database updates. The service layer </w:t>
-      </w:r>
-      <w:r>
-        <w:t>protects inventory operations using transactions and locking, while role-based security keeps administrative functions restricted.</w:t>
+        <w:t>The project improves warehouse accuracy by replacing manual stock tracking with transaction-safe database updates. The service layer protects inventory operations using transactions and locking, while role-based security keeps administrative functions restricted.</w:t>
       </w:r>
     </w:p>
     <w:p>
       <w:r>
-        <w:t>Overall, the project demonstrates how a real business problem can be solved using a full-stack web application. It connects u</w:t>
-      </w:r>
-      <w:r>
-        <w:t>ser-friendly screens with strong backend logic and a reliable relational database. The project also follows professional practices such as validation, exception handling, testing, Docker support and CI.</w:t>
+        <w:t>Overall, the project demonstrates how a real business problem can be solved using a full-stack web application. It connects user-friendly screens with strong backend logic and a reliable relational database. The project also follows professional practices such as validation, exception handling, testing, Docker support and CI.</w:t>
       </w:r>
     </w:p>
     <w:tbl>
@@ -20507,13 +20026,7 @@
               <w:rPr>
                 <w:sz w:val="18"/>
               </w:rPr>
-              <w:t>Stock quantity is updat</w:t>
-            </w:r>
-            <w:r>
-              <w:rPr>
-                <w:sz w:val="18"/>
-              </w:rPr>
-              <w:t>ed through controlled transactions instead of manual editing.</w:t>
+              <w:t>Stock quantity is updated through controlled transactions instead of manual editing.</w:t>
             </w:r>
           </w:p>
         </w:tc>
@@ -20639,13 +20152,7 @@
               <w:rPr>
                 <w:sz w:val="18"/>
               </w:rPr>
-              <w:t xml:space="preserve">JWT login and </w:t>
-            </w:r>
-            <w:r>
-              <w:rPr>
-                <w:sz w:val="18"/>
-              </w:rPr>
-              <w:t>roles protect sensitive operations.</w:t>
+              <w:t>JWT login and roles protect sensitive operations.</w:t>
             </w:r>
           </w:p>
         </w:tc>
@@ -20703,10 +20210,7 @@
         <w:t xml:space="preserve">Learning outcome: </w:t>
       </w:r>
       <w:r>
-        <w:t>This project gives practical experience in Java backend development, React frontend development, relational database design, REST A</w:t>
-      </w:r>
-      <w:r>
-        <w:t>PI integration, security and testing.</w:t>
+        <w:t>This project gives practical experience in Java backend development, React frontend development, relational database design, REST API integration, security and testing.</w:t>
       </w:r>
     </w:p>
     <w:p>
@@ -20741,10 +20245,7 @@
         <w:spacing w:after="80"/>
       </w:pPr>
       <w:r>
-        <w:t>Introduce Flyway or Liquibase databas</w:t>
-      </w:r>
-      <w:r>
-        <w:t>e migrations for production-grade schema management.</w:t>
+        <w:t>Introduce Flyway or Liquibase database migrations for production-grade schema management.</w:t>
       </w:r>
     </w:p>
     <w:p>
@@ -20780,10 +20281,7 @@
         <w:spacing w:after="80"/>
       </w:pPr>
       <w:r>
-        <w:t>Add CSV/Excel import and expor</w:t>
-      </w:r>
-      <w:r>
-        <w:t>t for product and inventory data.</w:t>
+        <w:t>Add CSV/Excel import and export for product and inventory data.</w:t>
       </w:r>
     </w:p>
     <w:p>
@@ -20807,10 +20305,7 @@
     <w:p>
       <w:r>
         <w:lastRenderedPageBreak/>
-        <w:t>These future enhancements can make the system more useful in a</w:t>
-      </w:r>
-      <w:r>
-        <w:t xml:space="preserve"> real warehouse environment. The current project builds the foundation, and later improvements can focus on automation, analytics, mobile use and cloud deployment.</w:t>
+        <w:t>These future enhancements can make the system more useful in a real warehouse environment. The current project builds the foundation, and later improvements can focus on automation, analytics, mobile use and cloud deployment.</w:t>
       </w:r>
     </w:p>
     <w:p>
@@ -20833,10 +20328,7 @@
         <w:spacing w:after="80"/>
       </w:pPr>
       <w:r>
-        <w:t xml:space="preserve">Infotact Technical Internship Program project </w:t>
-      </w:r>
-      <w:r>
-        <w:t>specification document.</w:t>
+        <w:t>Infotact Technical Internship Program project specification document.</w:t>
       </w:r>
     </w:p>
     <w:p>
@@ -20863,10 +20355,7 @@
         <w:spacing w:after="80"/>
       </w:pPr>
       <w:r>
-        <w:t>Spring Data JPA Documentation - https://spring.io/projects/spring-data</w:t>
-      </w:r>
-      <w:r>
-        <w:t>-jpa</w:t>
+        <w:t>Spring Data JPA Documentation - https://spring.io/projects/spring-data-jpa</w:t>
       </w:r>
     </w:p>
     <w:p>
@@ -20911,10 +20400,7 @@
         <w:spacing w:after="80"/>
       </w:pPr>
       <w:r>
-        <w:t>ZXing Barcode Library - https://github.c</w:t>
-      </w:r>
-      <w:r>
-        <w:t>om/zxing/zxing</w:t>
+        <w:t>ZXing Barcode Library - https://github.com/zxing/zxing</w:t>
       </w:r>
     </w:p>
     <w:p>
@@ -20931,11 +20417,12 @@
         <w:br w:type="page"/>
       </w:r>
     </w:p>
-    <w:bookmarkEnd w:id="1"/>
     <w:p>
       <w:pPr>
         <w:pStyle w:val="Heading1"/>
       </w:pPr>
+      <w:bookmarkStart w:id="3" w:name="_Hlk229664945"/>
+      <w:bookmarkEnd w:id="1"/>
       <w:r>
         <w:lastRenderedPageBreak/>
         <w:t>Chapter 7: Appendices</w:t>
@@ -20972,14 +20459,7 @@
           <w:sz w:val="18"/>
         </w:rPr>
         <w:br/>
-        <w:t>scripts\run-backend-local</w:t>
-      </w:r>
-      <w:r>
-        <w:rPr>
-          <w:rFonts w:ascii="Consolas" w:eastAsia="Consolas" w:hAnsi="Consolas"/>
-          <w:sz w:val="18"/>
-        </w:rPr>
-        <w:t>.cmd</w:t>
+        <w:t>scripts\run-backend-local.cmd</w:t>
       </w:r>
       <w:r>
         <w:rPr>
@@ -21018,10 +20498,7 @@
     </w:p>
     <w:p>
       <w:r>
-        <w:t xml:space="preserve">The backend should be started first because the frontend depends on backend APIs for login and data. PostgreSQL </w:t>
-      </w:r>
-      <w:r>
-        <w:t>must also be running before the backend starts. After both servers start, the frontend can be opened in a browser.</w:t>
+        <w:t>The backend should be started first because the frontend depends on backend APIs for login and data. PostgreSQL must also be running before the backend starts. After both servers start, the frontend can be opened in a browser.</w:t>
       </w:r>
     </w:p>
     <w:p>
@@ -21537,13 +21014,7 @@
               <w:rPr>
                 <w:sz w:val="16"/>
               </w:rPr>
-              <w:t xml:space="preserve">List or </w:t>
-            </w:r>
-            <w:r>
-              <w:rPr>
-                <w:sz w:val="16"/>
-              </w:rPr>
-              <w:t>create products.</w:t>
+              <w:t>List or create products.</w:t>
             </w:r>
           </w:p>
         </w:tc>
@@ -22098,13 +21569,7 @@
               <w:rPr>
                 <w:sz w:val="18"/>
               </w:rPr>
-              <w:t xml:space="preserve">Spring Boot backend source </w:t>
-            </w:r>
-            <w:r>
-              <w:rPr>
-                <w:sz w:val="18"/>
-              </w:rPr>
-              <w:t>code, tests and Maven configuration.</w:t>
+              <w:t>Spring Boot backend source code, tests and Maven configuration.</w:t>
             </w:r>
           </w:p>
         </w:tc>
@@ -22230,13 +21695,7 @@
               <w:rPr>
                 <w:sz w:val="18"/>
               </w:rPr>
-              <w:t>Helper scripts for running backend, frontend and performance che</w:t>
-            </w:r>
-            <w:r>
-              <w:rPr>
-                <w:sz w:val="18"/>
-              </w:rPr>
-              <w:t>cks.</w:t>
+              <w:t>Helper scripts for running backend, frontend and performance checks.</w:t>
             </w:r>
           </w:p>
         </w:tc>
@@ -22447,13 +21906,7 @@
               <w:rPr>
                 <w:sz w:val="16"/>
               </w:rPr>
-              <w:t xml:space="preserve">JWT </w:t>
-            </w:r>
-            <w:r>
-              <w:rPr>
-                <w:sz w:val="16"/>
-              </w:rPr>
-              <w:t>authentication</w:t>
+              <w:t>JWT authentication</w:t>
             </w:r>
           </w:p>
         </w:tc>
@@ -22679,13 +22132,7 @@
               <w:rPr>
                 <w:sz w:val="16"/>
               </w:rPr>
-              <w:t xml:space="preserve">DTO validation checks </w:t>
-            </w:r>
-            <w:r>
-              <w:rPr>
-                <w:sz w:val="16"/>
-              </w:rPr>
-              <w:t>required and positive fields.</w:t>
+              <w:t>DTO validation checks required and positive fields.</w:t>
             </w:r>
           </w:p>
         </w:tc>
@@ -22871,13 +22318,7 @@
               <w:rPr>
                 <w:sz w:val="16"/>
               </w:rPr>
-              <w:t xml:space="preserve">Database and JWT </w:t>
-            </w:r>
-            <w:r>
-              <w:rPr>
-                <w:sz w:val="16"/>
-              </w:rPr>
-              <w:t>values can be supplied through environment variables.</w:t>
+              <w:t>Database and JWT values can be supplied through environment variables.</w:t>
             </w:r>
           </w:p>
         </w:tc>
@@ -22916,10 +22357,7 @@
         <w:spacing w:after="80"/>
       </w:pPr>
       <w:r>
-        <w:t>Maintain</w:t>
-      </w:r>
-      <w:r>
-        <w:t xml:space="preserve"> a genuine GitHub commit history across the development period.</w:t>
+        <w:t>Maintain a genuine GitHub commit history across the development period.</w:t>
       </w:r>
     </w:p>
     <w:p>
@@ -23201,13 +22639,7 @@
               <w:rPr>
                 <w:sz w:val="18"/>
               </w:rPr>
-              <w:t>QR/barcode generation, order processing, inven</w:t>
-            </w:r>
-            <w:r>
-              <w:rPr>
-                <w:sz w:val="18"/>
-              </w:rPr>
-              <w:t>tory decrement and exception handling.</w:t>
+              <w:t>QR/barcode generation, order processing, inventory decrement and exception handling.</w:t>
             </w:r>
           </w:p>
         </w:tc>
@@ -23298,18 +22730,12 @@
     <w:p/>
     <w:p>
       <w:r>
-        <w:t xml:space="preserve">Progress evidence should be supported by GitHub commits, pull requests and screenshots of the </w:t>
-      </w:r>
-      <w:r>
-        <w:t>running system. The project repository includes CI configuration, Docker support, backend tests and frontend build scripts.</w:t>
+        <w:t>Progress evidence should be supported by GitHub commits, pull requests and screenshots of the running system. The project repository includes CI configuration, Docker support, backend tests and frontend build scripts.</w:t>
       </w:r>
     </w:p>
     <w:p>
       <w:r>
-        <w:t>The progress sheet is useful because it shows that the project was developed in stages. A staged approach is better than building ev</w:t>
-      </w:r>
-      <w:r>
-        <w:t>erything at once. First the base project and database are created, then business logic is added, then security and frontend integration are completed, and finally testing and documentation are prepared.</w:t>
+        <w:t>The progress sheet is useful because it shows that the project was developed in stages. A staged approach is better than building everything at once. First the base project and database are created, then business logic is added, then security and frontend integration are completed, and finally testing and documentation are prepared.</w:t>
       </w:r>
     </w:p>
     <w:tbl>
@@ -23417,13 +22843,7 @@
               <w:rPr>
                 <w:sz w:val="18"/>
               </w:rPr>
-              <w:t xml:space="preserve">Studied the </w:t>
-            </w:r>
-            <w:r>
-              <w:rPr>
-                <w:sz w:val="18"/>
-              </w:rPr>
-              <w:t>WMS project brief and identified modules such as warehouse, inventory, products and orders.</w:t>
+              <w:t>Studied the WMS project brief and identified modules such as warehouse, inventory, products and orders.</w:t>
             </w:r>
           </w:p>
         </w:tc>
@@ -23507,13 +22927,7 @@
               <w:rPr>
                 <w:sz w:val="18"/>
               </w:rPr>
-              <w:t xml:space="preserve">Implemented backend APIs, frontend </w:t>
-            </w:r>
-            <w:r>
-              <w:rPr>
-                <w:sz w:val="18"/>
-              </w:rPr>
-              <w:t>screens, PostgreSQL integration and role-based security.</w:t>
+              <w:t>Implemented backend APIs, frontend screens, PostgreSQL integration and role-based security.</w:t>
             </w:r>
           </w:p>
         </w:tc>
@@ -23597,23 +23011,17 @@
               <w:rPr>
                 <w:sz w:val="18"/>
               </w:rPr>
-              <w:t>Prepared black book report with project details, design, implementation, testing and future s</w:t>
-            </w:r>
-            <w:r>
-              <w:rPr>
-                <w:sz w:val="18"/>
-              </w:rPr>
-              <w:t>cope.</w:t>
+              <w:t>Prepared black book report with project details, design, implementation, testing and future scope.</w:t>
             </w:r>
           </w:p>
         </w:tc>
       </w:tr>
-      <w:bookmarkEnd w:id="0"/>
+      <w:bookmarkEnd w:id="2"/>
+      <w:bookmarkEnd w:id="3"/>
     </w:tbl>
     <w:p/>
     <w:sectPr>
-      <w:headerReference w:type="default" r:id="rId9"/>
-      <w:footerReference w:type="default" r:id="rId10"/>
+      <w:footerReference w:type="default" r:id="rId9"/>
       <w:pgSz w:w="12240" w:h="15840"/>
       <w:pgMar w:top="1440" w:right="1440" w:bottom="1440" w:left="1440" w:header="720" w:footer="720" w:gutter="0"/>
       <w:cols w:space="720"/>
@@ -23719,23 +23127,6 @@
     </w:p>
   </w:footnote>
 </w:footnotes>
-</file>
-
-<file path=word/header1.xml><?xml version="1.0" encoding="utf-8"?>
-<w:hdr xmlns:wpc="http://schemas.microsoft.com/office/word/2010/wordprocessingCanvas" xmlns:cx="http://schemas.microsoft.com/office/drawing/2014/chartex" xmlns:cx1="http://schemas.microsoft.com/office/drawing/2015/9/8/chartex" xmlns:cx2="http://schemas.microsoft.com/office/drawing/2015/10/21/chartex" xmlns:cx3="http://schemas.microsoft.com/office/drawing/2016/5/9/chartex" xmlns:cx4="http://schemas.microsoft.com/office/drawing/2016/5/10/chartex" xmlns:cx5="http://schemas.microsoft.com/office/drawing/2016/5/11/chartex" xmlns:cx6="http://schemas.microsoft.com/office/drawing/2016/5/12/chartex" xmlns:cx7="http://schemas.microsoft.com/office/drawing/2016/5/13/chartex" xmlns:cx8="http://schemas.microsoft.com/office/drawing/2016/5/14/chartex" xmlns:mc="http://schemas.openxmlformats.org/markup-compatibility/2006" xmlns:aink="http://schemas.microsoft.com/office/drawing/2016/ink" xmlns:am3d="http://schemas.microsoft.com/office/drawing/2017/model3d" xmlns:o="urn:schemas-microsoft-com:office:office" xmlns:r="http://schemas.openxmlformats.org/officeDocument/2006/relationships" xmlns:m="http://schemas.openxmlformats.org/officeDocument/2006/math" xmlns:v="urn:schemas-microsoft-com:vml" xmlns:wp14="http://schemas.microsoft.com/office/word/2010/wordprocessingDrawing" xmlns:wp="http://schemas.openxmlformats.org/drawingml/2006/wordprocessingDrawing" xmlns:w10="urn:schemas-microsoft-com:office:word" xmlns:w="http://schemas.openxmlformats.org/wordprocessingml/2006/main" xmlns:w14="http://schemas.microsoft.com/office/word/2010/wordml" xmlns:w15="http://schemas.microsoft.com/office/word/2012/wordml" xmlns:w16cex="http://schemas.microsoft.com/office/word/2018/wordml/cex" xmlns:w16cid="http://schemas.microsoft.com/office/word/2016/wordml/cid" xmlns:w16="http://schemas.microsoft.com/office/word/2018/wordml" xmlns:w16sdtdh="http://schemas.microsoft.com/office/word/2020/wordml/sdtdatahash" xmlns:w16se="http://schemas.microsoft.com/office/word/2015/wordml/symex" xmlns:wpg="http://schemas.microsoft.com/office/word/2010/wordprocessingGroup" xmlns:wpi="http://schemas.microsoft.com/office/word/2010/wordprocessingInk" xmlns:wne="http://schemas.microsoft.com/office/word/2006/wordml" xmlns:wps="http://schemas.microsoft.com/office/word/2010/wordprocessingShape" mc:Ignorable="w14 w15 w16se w16cid w16 w16cex w16sdtdh wp14">
-  <w:p>
-    <w:pPr>
-      <w:pStyle w:val="Header"/>
-    </w:pPr>
-    <w:r>
-      <w:rPr>
-        <w:color w:val="5A5A5A"/>
-        <w:sz w:val="18"/>
-      </w:rPr>
-      <w:t>Advanced Warehouse Management System - Black Book</w:t>
-    </w:r>
-  </w:p>
-</w:hdr>
 </file>
 
 <file path=word/numbering.xml><?xml version="1.0" encoding="utf-8"?>
@@ -23875,7 +23266,7 @@
   <w:abstractNum w:abstractNumId="7" w15:restartNumberingAfterBreak="0">
     <w:nsid w:val="FFFFFF88"/>
     <w:multiLevelType w:val="singleLevel"/>
-    <w:tmpl w:val="46743320"/>
+    <w:tmpl w:val="6B366BE0"/>
     <w:lvl w:ilvl="0">
       <w:start w:val="1"/>
       <w:numFmt w:val="decimal"/>
@@ -23893,7 +23284,7 @@
   <w:abstractNum w:abstractNumId="8" w15:restartNumberingAfterBreak="0">
     <w:nsid w:val="FFFFFF89"/>
     <w:multiLevelType w:val="singleLevel"/>
-    <w:tmpl w:val="ECEA888E"/>
+    <w:tmpl w:val="6E0672DE"/>
     <w:lvl w:ilvl="0">
       <w:start w:val="1"/>
       <w:numFmt w:val="bullet"/>
@@ -24226,11 +23617,6 @@
     <w:lsdException w:name="Book Title" w:uiPriority="33" w:qFormat="1"/>
     <w:lsdException w:name="Bibliography" w:semiHidden="1" w:uiPriority="37" w:unhideWhenUsed="1"/>
     <w:lsdException w:name="TOC Heading" w:semiHidden="1" w:uiPriority="39" w:unhideWhenUsed="1" w:qFormat="1"/>
-    <w:lsdException w:name="Plain Table 5" w:semiHidden="1" w:unhideWhenUsed="1"/>
-    <w:lsdException w:name="Grid Table Light" w:semiHidden="1" w:unhideWhenUsed="1"/>
-    <w:lsdException w:name="Grid Table 1 Light" w:semiHidden="1" w:unhideWhenUsed="1"/>
-    <w:lsdException w:name="Grid Table 2" w:semiHidden="1" w:unhideWhenUsed="1"/>
-    <w:lsdException w:name="Grid Table 3" w:semiHidden="1" w:unhideWhenUsed="1"/>
     <w:lsdException w:name="Grid Table 4" w:uiPriority="49"/>
     <w:lsdException w:name="Grid Table 5 Dark" w:uiPriority="50"/>
     <w:lsdException w:name="Grid Table 6 Colorful" w:uiPriority="51"/>

</xml_diff>